<commit_message>
docs: normalize report artifacts
</commit_message>
<xml_diff>
--- a/artifacts/reports/architecture/ARCH-02_タブレットPOS_端末アプリケーション構造設計書/ARCH-02_タブレットPOS_端末アプリケーション構造設計書.docx
+++ b/artifacts/reports/architecture/ARCH-02_タブレットPOS_端末アプリケーション構造設計書/ARCH-02_タブレットPOS_端末アプリケーション構造設計書.docx
@@ -8,6 +8,12 @@
           <w:rFonts w:ascii="Meiryo UI" w:eastAsia="Meiryo UI" w:hAnsi="Meiryo UI" w:cs="Meiryo UI" w:hint="eastAsia"/>
         </w:rPr>
       </w:pPr>
+    </w:p>
+    <w:p>
+      <w:pPr/>
+      <w:r>
+        <w:t>文書ID: ARCH-02</w:t>
+      </w:r>
     </w:p>
     <w:p>
       <w:pPr>
@@ -2139,7 +2145,7 @@
                 <w:sz w:val="18"/>
                 <w:szCs w:val="18"/>
               </w:rPr>
-              <w:t xml:space="preserve">プログラム仕様書_POS-HOST-01_タブレットPOS_HOST_NamedPipeCommandServer.xlsx</w:t>
+              <w:t xml:space="preserve">プログラム仕様書_PS-HOST-01_タブレットPOS_HOST_NamedPipeCommandServer.xlsx</w:t>
             </w:r>
           </w:p>
         </w:tc>
@@ -2177,7 +2183,7 @@
                 <w:sz w:val="18"/>
                 <w:szCs w:val="18"/>
               </w:rPr>
-              <w:t xml:space="preserve">プログラム仕様書_POS-HOST-02_タブレットPOS_HOST_NamedPipeDeviceHostAdapter.xlsx</w:t>
+              <w:t xml:space="preserve">プログラム仕様書_PS-HOST-02_タブレットPOS_HOST_NamedPipeDeviceHostAdapter.xlsx</w:t>
             </w:r>
           </w:p>
         </w:tc>
@@ -2215,7 +2221,7 @@
                 <w:sz w:val="18"/>
                 <w:szCs w:val="18"/>
               </w:rPr>
-              <w:t xml:space="preserve">プログラム仕様書_POS-HOST-03_タブレットPOS_HOST_DeviceCommandRouter.xlsx</w:t>
+              <w:t xml:space="preserve">プログラム仕様書_PS-HOST-03_タブレットPOS_HOST_DeviceCommandRouter.xlsx</w:t>
             </w:r>
           </w:p>
         </w:tc>
@@ -2253,7 +2259,7 @@
                 <w:sz w:val="18"/>
                 <w:szCs w:val="18"/>
               </w:rPr>
-              <w:t xml:space="preserve">プログラム仕様書_POS-HOST-04_タブレットPOS_HOST_DeviceCommandCore.xlsx</w:t>
+              <w:t xml:space="preserve">プログラム仕様書_PS-HOST-04_タブレットPOS_HOST_DeviceCommandCore.xlsx</w:t>
             </w:r>
           </w:p>
         </w:tc>
@@ -2291,7 +2297,7 @@
                 <w:sz w:val="18"/>
                 <w:szCs w:val="18"/>
               </w:rPr>
-              <w:t xml:space="preserve">プログラム仕様書_POS-HOST-05_タブレットPOS_HOST_KsHost.xlsx</w:t>
+              <w:t xml:space="preserve">プログラム仕様書_PS-HOST-05_タブレットPOS_HOST_KsHost.xlsx</w:t>
             </w:r>
           </w:p>
         </w:tc>
@@ -2329,7 +2335,7 @@
                 <w:sz w:val="18"/>
                 <w:szCs w:val="18"/>
               </w:rPr>
-              <w:t xml:space="preserve">プログラム仕様書_POS-HOST-06_タブレットPOS_HOST_KsDeviceManager.xlsx</w:t>
+              <w:t xml:space="preserve">プログラム仕様書_PS-HOST-06_タブレットPOS_HOST_KsDeviceManager.xlsx</w:t>
             </w:r>
           </w:p>
         </w:tc>
@@ -2367,7 +2373,7 @@
                 <w:sz w:val="18"/>
                 <w:szCs w:val="18"/>
               </w:rPr>
-              <w:t xml:space="preserve">プログラム仕様書_POS-HOST-07_タブレットPOS_HOST_DeviceBase.xlsx</w:t>
+              <w:t xml:space="preserve">プログラム仕様書_PS-HOST-07_タブレットPOS_HOST_DeviceBase.xlsx</w:t>
             </w:r>
           </w:p>
         </w:tc>
@@ -2405,7 +2411,7 @@
                 <w:sz w:val="18"/>
                 <w:szCs w:val="18"/>
               </w:rPr>
-              <w:t xml:space="preserve">プログラム仕様書_POS-HOST-08_タブレットPOS_HOST_CashChangerByRT300.xlsx</w:t>
+              <w:t xml:space="preserve">プログラム仕様書_PS-HOST-08_タブレットPOS_HOST_CashChangerByRT300.xlsx</w:t>
             </w:r>
           </w:p>
         </w:tc>
@@ -2443,7 +2449,7 @@
                 <w:sz w:val="18"/>
                 <w:szCs w:val="18"/>
               </w:rPr>
-              <w:t xml:space="preserve">プログラム仕様書_POS-HOST-09_タブレットPOS_HOST_CashChangerByRT300Form.xlsx</w:t>
+              <w:t xml:space="preserve">プログラム仕様書_PS-HOST-09_タブレットPOS_HOST_CashChangerByRT300Form.xlsx</w:t>
             </w:r>
           </w:p>
         </w:tc>
@@ -2481,7 +2487,7 @@
                 <w:sz w:val="18"/>
                 <w:szCs w:val="18"/>
               </w:rPr>
-              <w:t xml:space="preserve">プログラム仕様書_POS-HOST-10_タブレットPOS_HOST_CashDrawerBySharp.xlsx</w:t>
+              <w:t xml:space="preserve">プログラム仕様書_PS-HOST-10_タブレットPOS_HOST_CashDrawerBySharp.xlsx</w:t>
             </w:r>
           </w:p>
         </w:tc>
@@ -2519,7 +2525,7 @@
                 <w:sz w:val="18"/>
                 <w:szCs w:val="18"/>
               </w:rPr>
-              <w:t xml:space="preserve">プログラム仕様書_POS-HOST-11_タブレットPOS_HOST_CustomerDisplayBySharp.xlsx</w:t>
+              <w:t xml:space="preserve">プログラム仕様書_PS-HOST-11_タブレットPOS_HOST_CustomerDisplayBySharp.xlsx</w:t>
             </w:r>
           </w:p>
         </w:tc>

</xml_diff>